<commit_message>
Unify shared answers and confirmed evidence
</commit_message>
<xml_diff>
--- a/source/Estrada_Resume_Implementation.docx
+++ b/source/Estrada_Resume_Implementation.docx
@@ -254,11 +254,7 @@
         <w:rPr/>
       </w:pPr>
       <w:r>
-        <w:rPr>
-          <w:rFonts w:ascii="Carlito" w:hAnsi="Carlito"/>
-          <w:sz w:val="22"/>
-        </w:rPr>
-        <w:t>Reduced migration and audit risk from Aptean Intuitive to Epicor Kinetic by extracting, querying, transforming, updating, and validating system/database records through ETL tools, SQL checks, user access reviews, control validation, and cutover coordination</w:t>
+        <w:t>Reduced migration and audit risk from Aptean Intuitive to Epicor Kinetic by extracting, querying, transforming, updating, and validating system/database records through ETL tools, SQL checks, user access reviews, control validation, cutover coordination, and least-privilege permission tightening after incident backtracking tied avoidable work-order losses to access mistakes</w:t>
       </w:r>
     </w:p>
     <w:p>
@@ -372,11 +368,7 @@
         <w:rPr/>
       </w:pPr>
       <w:r>
-        <w:rPr>
-          <w:rFonts w:ascii="Carlito" w:hAnsi="Carlito"/>
-          <w:sz w:val="22"/>
-        </w:rPr>
-        <w:t>Supported occasional Epicor Kinetic administration, security/access validation, and user training while preserving Aptean Intuitive as the primary owned operating platform through final cutover.</w:t>
+        <w:t>Supported occasional Epicor Kinetic administration, security/access validation, barcode-scanner workflow verification in the software layer, and user training while preserving Aptean Intuitive as the primary owned operating platform through final cutover.</w:t>
       </w:r>
     </w:p>
     <w:p>

</xml_diff>

<commit_message>
Stabilize document quality repair gates
</commit_message>
<xml_diff>
--- a/source/Estrada_Resume_Implementation.docx
+++ b/source/Estrada_Resume_Implementation.docx
@@ -254,25 +254,25 @@
         <w:rPr/>
       </w:pPr>
       <w:r>
-        <w:t>Reduced migration and audit risk from Aptean Intuitive to Epicor Kinetic by extracting, querying, transforming, updating, and validating system/database records through ETL tools, SQL checks, user access reviews, control validation, cutover coordination, and least-privilege permission tightening after incident backtracking tied avoidable work-order losses to access mistakes</w:t>
-      </w:r>
-    </w:p>
-    <w:p>
-      <w:pPr>
-        <w:pStyle w:val="Normal"/>
-        <w:numPr>
-          <w:ilvl w:val="0"/>
-          <w:numId w:val="1"/>
-        </w:numPr>
-        <w:spacing w:lineRule="auto" w:line="259" w:before="0" w:after="60"/>
-        <w:rPr/>
-      </w:pPr>
-      <w:r>
-        <w:rPr>
-          <w:rFonts w:ascii="Carlito" w:hAnsi="Carlito"/>
-          <w:sz w:val="22"/>
-        </w:rPr>
-        <w:t>Improved VP- and director-level decision-making on the company's enterprise ERP platform by turning ambiguous operations, finance, and engineering needs into scoped system recommendations, vendor tradeoffs, cost/timeline options, and risk-aware implementation plans before build work began</w:t>
+        <w:t>Cut migration and audit risk in the Aptean Intuitive to Epicor Kinetic transition by validating system and database records with ETL tools and SQL checks, coordinating cutover, and tightening user access to least-privilege after a work-order loss was traced to an access gap</w:t>
+      </w:r>
+    </w:p>
+    <w:p>
+      <w:pPr>
+        <w:pStyle w:val="Normal"/>
+        <w:numPr>
+          <w:ilvl w:val="0"/>
+          <w:numId w:val="1"/>
+        </w:numPr>
+        <w:spacing w:lineRule="auto" w:line="259" w:before="0" w:after="60"/>
+        <w:rPr/>
+      </w:pPr>
+      <w:r>
+        <w:rPr>
+          <w:rFonts w:ascii="Carlito" w:hAnsi="Carlito"/>
+          <w:sz w:val="22"/>
+        </w:rPr>
+        <w:t>Improved VP and director decisions on the enterprise ERP platform by turning ambiguous operations, finance, and engineering needs into scoped recommendations with vendor, cost, and timeline tradeoffs before build work began</w:t>
       </w:r>
     </w:p>
     <w:p>
@@ -318,7 +318,7 @@
         <w:rPr/>
       </w:pPr>
       <w:r>
-        <w:t>Improved change management readiness across operations, finance, and engineering teams by designing enablement materials, onboarding processes, role-based training, and release communications that reduced resistance to system changes</w:t>
+        <w:t>Drove technology adoption across operations, finance, and engineering teams by designing role-based training, onboarding, and release communications that reduced resistance to system change</w:t>
       </w:r>
     </w:p>
     <w:p>
@@ -354,7 +354,7 @@
           <w:rFonts w:ascii="Carlito" w:hAnsi="Carlito"/>
           <w:sz w:val="22"/>
         </w:rPr>
-        <w:t>Coordinated business users, vendors, and technical stakeholders through concurrent migration, reporting, training, and warehouse-readiness workstreams without direct-report authority.</w:t>
+        <w:t>Coordinated business users, vendors, and technical stakeholders across concurrent migration, reporting, and training workstreams without direct-report authority.</w:t>
       </w:r>
     </w:p>
     <w:p>
@@ -386,7 +386,7 @@
           <w:rFonts w:ascii="Carlito" w:hAnsi="Carlito"/>
           <w:sz w:val="22"/>
         </w:rPr>
-        <w:t>Led a five-month cross-functional initiative to replace a years-outdated EFT/ACH file integration, coordinating across internal IT, global finance, Aptean, and Truist Bank to design, validate, and deploy a compliant payment workflow that resolved a long-standing financial infrastructure gap and restored payment process integrity.</w:t>
+        <w:t>Led a five-month cross-functional initiative to replace an outdated EFT/ACH file integration, coordinating internal IT, global finance, Aptean, and Truist Bank to deploy a compliant payment workflow that closed a long-standing infrastructure gap.</w:t>
       </w:r>
     </w:p>
     <w:p>
@@ -508,7 +508,7 @@
           <w:rFonts w:ascii="Carlito" w:hAnsi="Carlito"/>
           <w:sz w:val="22"/>
         </w:rPr>
-        <w:t>Moved international manufacturing clients from unclear requirements to usable go-live outcomes by leading discovery, requirements definition, configuration, data migration, integration, testing, customer training, and post-go-live support in Aptean Encompix</w:t>
+        <w:t>Moved international manufacturing clients from unclear requirements to usable go-live outcomes through discovery, configuration, testing, customer training, and post-go-live support in Aptean Encompix</w:t>
       </w:r>
     </w:p>
     <w:p>
@@ -792,7 +792,7 @@
           <w:rFonts w:ascii="Carlito" w:hAnsi="Carlito"/>
           <w:sz w:val="22"/>
         </w:rPr>
-        <w:t>Helped build and support adoption of a zero-to-one internal SMS support channel as a founding pilot team member, configuring LivePerson LiveEngage chat/text workflows, automated greetings and closings, AI-assisted chatbot logic, and early channel-usage monitoring for a customer communication workflow that did not previously exist</w:t>
+        <w:t>Helped launch a zero-to-one internal SMS support channel as a founding pilot team member, configuring LivePerson LiveEngage chat/text workflows, automated greetings and closings, AI-assisted chatbot logic, and early channel-usage monitoring</w:t>
       </w:r>
     </w:p>
     <w:p>
@@ -1162,21 +1162,21 @@
           <w:rFonts w:ascii="Carlito" w:hAnsi="Carlito"/>
           <w:sz w:val="22"/>
         </w:rPr>
-        <w:t>Solution Delivery and Program Leadership: Structured Discovery | Requirements Definition | Solution Design | SOW and FRD Development | Go-Live Readiness | Multi-Workstream Coordination</w:t>
-      </w:r>
-    </w:p>
-    <w:p>
-      <w:pPr>
-        <w:pStyle w:val="Normal"/>
-        <w:spacing w:before="0" w:after="60" w:line="259" w:lineRule="auto"/>
-        <w:rPr/>
-      </w:pPr>
-      <w:r>
-        <w:rPr>
-          <w:rFonts w:ascii="Carlito" w:hAnsi="Carlito"/>
-          <w:sz w:val="22"/>
-        </w:rPr>
-        <w:t>Customer Success and Account Value: Account Recovery | Renewal Risk Management | Executive Business Reviews and QBRs | Success Planning | Adoption Strategy | Customer Training</w:t>
+        <w:t>Solution Delivery and Program Leadership: Structured Discovery | Requirements Definition | Solution Design | SOW and FRD Development | Go-Live Readiness | Multi-Workstream Coordination | Process Management</w:t>
+      </w:r>
+    </w:p>
+    <w:p>
+      <w:pPr>
+        <w:pStyle w:val="Normal"/>
+        <w:spacing w:before="0" w:after="60" w:line="259" w:lineRule="auto"/>
+        <w:rPr/>
+      </w:pPr>
+      <w:r>
+        <w:rPr>
+          <w:rFonts w:ascii="Carlito" w:hAnsi="Carlito"/>
+          <w:sz w:val="22"/>
+        </w:rPr>
+        <w:t>Customer Success and Account Value: Account Recovery | Renewal Risk Management | Executive Business Reviews and QBRs | Success Planning | Adoption Strategy | Customer Training | Customer Service</w:t>
       </w:r>
     </w:p>
     <w:p>

</xml_diff>

<commit_message>
Preserve resume and interview prep baseline
</commit_message>
<xml_diff>
--- a/source/Estrada_Resume_Implementation.docx
+++ b/source/Estrada_Resume_Implementation.docx
@@ -208,6 +208,96 @@
           <w:rFonts w:ascii="Carlito" w:hAnsi="Carlito"/>
           <w:sz w:val="22"/>
         </w:rPr>
+        <w:t>Owned ERP access governance and least-privilege permissions across systems, folder access, and reporting, and joined the Global IT team to manage broader IT permissions.</w:t>
+      </w:r>
+    </w:p>
+    <w:p>
+      <w:pPr>
+        <w:pStyle w:val="Normal"/>
+        <w:numPr>
+          <w:ilvl w:val="0"/>
+          <w:numId w:val="1"/>
+        </w:numPr>
+        <w:spacing w:lineRule="auto" w:line="259" w:before="0" w:after="60"/>
+        <w:rPr/>
+      </w:pPr>
+      <w:r>
+        <w:rPr>
+          <w:rFonts w:ascii="Carlito" w:hAnsi="Carlito"/>
+          <w:sz w:val="22"/>
+        </w:rPr>
+        <w:t>Supported compliance audits with engineering and client stakeholders, providing access reviews and control documentation.</w:t>
+      </w:r>
+    </w:p>
+    <w:p>
+      <w:pPr>
+        <w:pStyle w:val="Normal"/>
+        <w:numPr>
+          <w:ilvl w:val="0"/>
+          <w:numId w:val="1"/>
+        </w:numPr>
+        <w:spacing w:lineRule="auto" w:line="259" w:before="0" w:after="60"/>
+        <w:rPr/>
+      </w:pPr>
+      <w:r>
+        <w:rPr>
+          <w:rFonts w:ascii="Carlito" w:hAnsi="Carlito"/>
+          <w:sz w:val="22"/>
+        </w:rPr>
+        <w:t>Ran weekly onboarding and system training for new hires, plus targeted sessions on product changes, updates, and customizations I proposed.</w:t>
+      </w:r>
+    </w:p>
+    <w:p>
+      <w:pPr>
+        <w:pStyle w:val="Normal"/>
+        <w:numPr>
+          <w:ilvl w:val="0"/>
+          <w:numId w:val="1"/>
+        </w:numPr>
+        <w:spacing w:lineRule="auto" w:line="259" w:before="0" w:after="60"/>
+        <w:rPr/>
+      </w:pPr>
+      <w:r>
+        <w:rPr>
+          <w:rFonts w:ascii="Carlito" w:hAnsi="Carlito"/>
+          <w:sz w:val="22"/>
+        </w:rPr>
+        <w:t>Built automated workflows for high-volume inventory adjustments and Approved Manufacturer List maintenance, cutting manual work by 78% and inventory discrepancies by 22%.</w:t>
+      </w:r>
+    </w:p>
+    <w:p>
+      <w:pPr>
+        <w:pStyle w:val="Normal"/>
+        <w:numPr>
+          <w:ilvl w:val="0"/>
+          <w:numId w:val="1"/>
+        </w:numPr>
+        <w:spacing w:lineRule="auto" w:line="259" w:before="0" w:after="60"/>
+        <w:rPr/>
+      </w:pPr>
+      <w:r>
+        <w:rPr>
+          <w:rFonts w:ascii="Carlito" w:hAnsi="Carlito"/>
+          <w:sz w:val="22"/>
+        </w:rPr>
+        <w:t>Delivered enterprise technology projects end to end with a structured discovery-to-go-live approach, owning scope, milestones, cost and timeline tradeoffs, and cross-functional coordination.</w:t>
+      </w:r>
+    </w:p>
+    <w:p>
+      <w:pPr>
+        <w:pStyle w:val="Normal"/>
+        <w:numPr>
+          <w:ilvl w:val="0"/>
+          <w:numId w:val="1"/>
+        </w:numPr>
+        <w:spacing w:lineRule="auto" w:line="259" w:before="0" w:after="60"/>
+        <w:rPr/>
+      </w:pPr>
+      <w:r>
+        <w:rPr>
+          <w:rFonts w:ascii="Carlito" w:hAnsi="Carlito"/>
+          <w:sz w:val="22"/>
+        </w:rPr>
         <w:t>Reduced manual inventory adjustment work by 78% and lowered discrepancies by 22% by diagnosing a recurring warehouse accuracy problem and building an automated, auditable workflow in Aptean Intuitive</w:t>
       </w:r>
     </w:p>
@@ -318,7 +408,7 @@
         <w:rPr/>
       </w:pPr>
       <w:r>
-        <w:t>Drove technology adoption across operations, finance, and engineering teams by designing role-based training, onboarding, and release communications that reduced resistance to system change</w:t>
+        <w:t>Drove technology adoption across operations, finance, and engineering teams by building and maintaining core training programs, onboarding, and release communications that reduced resistance to system change</w:t>
       </w:r>
     </w:p>
     <w:p>
@@ -582,6 +672,34 @@
         <w:rPr/>
       </w:pPr>
       <w:r>
+        <w:t>Supported pre-sales for make-to-order and food and beverage manufacturers, authoring hundreds of RFP, RFI, and SOW documents and scoping customizations and integrations for deals averaging about $80K.</w:t>
+      </w:r>
+    </w:p>
+    <w:p>
+      <w:pPr>
+        <w:pStyle w:val="Normal"/>
+        <w:numPr>
+          <w:ilvl w:val="0"/>
+          <w:numId w:val="1"/>
+        </w:numPr>
+        <w:spacing w:lineRule="auto" w:line="259" w:before="0" w:after="60"/>
+        <w:rPr/>
+      </w:pPr>
+      <w:r>
+        <w:t>Delivered daily client training, quarterly user group meetings, and annual user conferences that kept adoption moving between releases.</w:t>
+      </w:r>
+    </w:p>
+    <w:p>
+      <w:pPr>
+        <w:pStyle w:val="Normal"/>
+        <w:numPr>
+          <w:ilvl w:val="0"/>
+          <w:numId w:val="1"/>
+        </w:numPr>
+        <w:spacing w:lineRule="auto" w:line="259" w:before="0" w:after="60"/>
+        <w:rPr/>
+      </w:pPr>
+      <w:r>
         <w:rPr>
           <w:rFonts w:eastAsia="Carlito" w:ascii="Carlito" w:hAnsi="Carlito"/>
           <w:b w:val="false"/>
@@ -1252,7 +1370,7 @@
           <w:i w:val="false"/>
           <w:sz w:val="22"/>
         </w:rPr>
-        <w:t>ITIL 4 Foundation  |  ServiceNow NextGen System Administrator  |  McKinsey Forward Learners</w:t>
+        <w:t>ITIL 4 Foundation  |  ServiceNow NextGen System Administrator  |  McKinsey Forward Learners | PMP (in progress)</w:t>
       </w:r>
     </w:p>
     <w:sectPr>

</xml_diff>

<commit_message>
Commit source resume content baseline
</commit_message>
<xml_diff>
--- a/source/Estrada_Resume_Implementation.docx
+++ b/source/Estrada_Resume_Implementation.docx
@@ -244,7 +244,7 @@
           <w:rFonts w:ascii="Carlito" w:hAnsi="Carlito"/>
           <w:sz w:val="22"/>
         </w:rPr>
-        <w:t>Ran weekly onboarding and system training for new hires, plus targeted sessions on product changes, updates, and customizations I proposed.</w:t>
+        <w:t>Ran weekly onboarding and system training for new hires, plus targeted sessions on product changes, updates, and proposed customizations.</w:t>
       </w:r>
     </w:p>
     <w:p>
@@ -312,7 +312,7 @@
         <w:rPr/>
       </w:pPr>
       <w:r>
-        <w:t>Partnered directly with plant controllers, accounting managers, and the CFO on month-end and year-end close, inventory adjustment, and audit readiness across five sites, owning ERP data integrity for finance and operations</w:t>
+        <w:t>Partnered with plant controllers, accounting managers, and the CFO on financial close, inventory accuracy, and audit readiness across five sites while protecting ERP data integrity for finance and operations</w:t>
       </w:r>
     </w:p>
     <w:p>
@@ -344,7 +344,7 @@
         <w:rPr/>
       </w:pPr>
       <w:r>
-        <w:t>Cut migration and audit risk in the Aptean Intuitive to Epicor Kinetic transition by validating system and database records with ETL tools and SQL checks, coordinating cutover, and tightening user access to least-privilege after a work-order loss was traced to an access gap</w:t>
+        <w:t>Cut migration and audit risk in the Aptean Intuitive to Epicor Kinetic move by validating records with ETL and SQL checks, coordinating cutover, and tightening user access to least-privilege</w:t>
       </w:r>
     </w:p>
     <w:p>
@@ -612,7 +612,7 @@
         <w:rPr/>
       </w:pPr>
       <w:r>
-        <w:t>Improved delivery predictability by producing Statements of Work and Functional Requirements Documents for complex implementations, data migrations, integrations, and customizations, establishing validated scope, milestones, and cost baselines before build work began</w:t>
+        <w:t>Improved delivery predictability by producing Statements of Work and Functional Requirements Documents that set validated scope, milestones, and cost baselines before build began on complex implementations, migrations, and integrations</w:t>
       </w:r>
     </w:p>
     <w:p>

</xml_diff>

<commit_message>
Clean source bullets for lint baseline
</commit_message>
<xml_diff>
--- a/source/Estrada_Resume_Implementation.docx
+++ b/source/Estrada_Resume_Implementation.docx
@@ -1,6 +1,6 @@
 
 <file path=word/document.xml><?xml version="1.0" encoding="utf-8"?>
-<w:document xmlns:o="urn:schemas-microsoft-com:office:office" xmlns:r="http://schemas.openxmlformats.org/officeDocument/2006/relationships" xmlns:v="urn:schemas-microsoft-com:vml" xmlns:w="http://schemas.openxmlformats.org/wordprocessingml/2006/main" xmlns:w10="urn:schemas-microsoft-com:office:word" xmlns:wp="http://schemas.openxmlformats.org/drawingml/2006/wordprocessingDrawing" xmlns:wps="http://schemas.microsoft.com/office/word/2010/wordprocessingShape" xmlns:wpg="http://schemas.microsoft.com/office/word/2010/wordprocessingGroup" xmlns:mc="http://schemas.openxmlformats.org/markup-compatibility/2006" xmlns:wp14="http://schemas.microsoft.com/office/word/2010/wordprocessingDrawing" xmlns:w14="http://schemas.microsoft.com/office/word/2010/wordml" xmlns:w15="http://schemas.microsoft.com/office/word/2012/wordml" mc:Ignorable="w14 wp14 w15">
+<w:document xmlns:ns1="http://schemas.openxmlformats.org/markup-compatibility/2006" xmlns:ns2="http://schemas.openxmlformats.org/officeDocument/2006/relationships" xmlns:w="http://schemas.openxmlformats.org/wordprocessingml/2006/main" ns1:Ignorable="w14 wp14 w15">
   <w:body>
     <w:p>
       <w:pPr>
@@ -52,7 +52,7 @@
         </w:rPr>
         <w:t xml:space="preserve">Atlanta, GA  |  770-710-4216  |  christianj1914@gmail.com  |  </w:t>
       </w:r>
-      <w:hyperlink r:id="rId2">
+      <w:hyperlink ns2:id="rId2">
         <w:r>
           <w:rPr>
             <w:rStyle w:val="Hyperlink"/>
@@ -458,7 +458,7 @@
         <w:rPr/>
       </w:pPr>
       <w:r>
-        <w:t>Supported occasional Epicor Kinetic administration, security/access validation, barcode-scanner workflow verification in the software layer, and user training while preserving Aptean Intuitive as the primary owned operating platform through final cutover.</w:t>
+        <w:t>Preserved Aptean Intuitive as the primary owned operating platform through final cutover while handling Epicor Kinetic administration, security/access validation, barcode-scanner workflow verification, and user training.</w:t>
       </w:r>
     </w:p>
     <w:p>
@@ -1122,7 +1122,7 @@
           <w:i w:val="false"/>
           <w:sz w:val="22"/>
         </w:rPr>
-        <w:t>Supported disaster recovery planning and system resilience improvements by documenting technical dependencies, issue patterns, and operational risks during an organizational transition.</w:t>
+        <w:t>Improved disaster recovery planning and system resilience by documenting technical dependencies, issue patterns, and operational risks during an organizational transition.</w:t>
       </w:r>
     </w:p>
     <w:p>

</xml_diff>